<commit_message>
Added notes into meeting and sprint docs.
</commit_message>
<xml_diff>
--- a/meeting_docs/Meeting_06_05_26.docx
+++ b/meeting_docs/Meeting_06_05_26.docx
@@ -172,6 +172,58 @@
                 <w:szCs w:val="16"/>
               </w:rPr>
               <w:br/>
+            </w:r>
+          </w:p>
+        </w:tc>
+      </w:tr>
+      <w:tr>
+        <w:trPr>
+          <w:cantSplit/>
+          <w:trHeight w:val="567"/>
+        </w:trPr>
+        <w:tc>
+          <w:tcPr>
+            <w:tcW w:w="1640" w:type="dxa"/>
+          </w:tcPr>
+          <w:p>
+            <w:pPr>
+              <w:pStyle w:val="MtedetaljerLable"/>
+              <w:rPr>
+                <w:rFonts w:ascii="Verdana" w:hAnsi="Verdana"/>
+                <w:sz w:val="18"/>
+                <w:szCs w:val="18"/>
+              </w:rPr>
+            </w:pPr>
+            <w:r>
+              <w:rPr>
+                <w:rFonts w:ascii="Verdana" w:hAnsi="Verdana"/>
+                <w:sz w:val="18"/>
+                <w:szCs w:val="18"/>
+              </w:rPr>
+              <w:t>Forfall:</w:t>
+            </w:r>
+          </w:p>
+        </w:tc>
+        <w:tc>
+          <w:tcPr>
+            <w:tcW w:w="7416" w:type="dxa"/>
+            <w:gridSpan w:val="4"/>
+          </w:tcPr>
+          <w:p>
+            <w:pPr>
+              <w:pStyle w:val="BodyText"/>
+              <w:rPr>
+                <w:rFonts w:ascii="Verdana" w:hAnsi="Verdana"/>
+                <w:sz w:val="18"/>
+                <w:szCs w:val="18"/>
+              </w:rPr>
+            </w:pPr>
+            <w:r>
+              <w:rPr>
+                <w:rFonts w:ascii="Verdana" w:hAnsi="Verdana"/>
+                <w:sz w:val="16"/>
+                <w:szCs w:val="16"/>
+              </w:rPr>
               <w:t>Saleh Abdel-</w:t>
             </w:r>
             <w:proofErr w:type="spellStart"/>
@@ -229,7 +281,7 @@
                 <w:sz w:val="18"/>
                 <w:szCs w:val="18"/>
               </w:rPr>
-              <w:t>Forfall:</w:t>
+              <w:t>Kopi til:</w:t>
             </w:r>
           </w:p>
         </w:tc>
@@ -282,59 +334,6 @@
                 <w:sz w:val="18"/>
                 <w:szCs w:val="18"/>
               </w:rPr>
-              <w:t>Kopi til:</w:t>
-            </w:r>
-          </w:p>
-        </w:tc>
-        <w:tc>
-          <w:tcPr>
-            <w:tcW w:w="7416" w:type="dxa"/>
-            <w:gridSpan w:val="4"/>
-          </w:tcPr>
-          <w:p>
-            <w:pPr>
-              <w:pStyle w:val="BodyText"/>
-              <w:rPr>
-                <w:rFonts w:ascii="Verdana" w:hAnsi="Verdana"/>
-                <w:sz w:val="18"/>
-                <w:szCs w:val="18"/>
-              </w:rPr>
-            </w:pPr>
-            <w:r>
-              <w:rPr>
-                <w:rFonts w:ascii="Verdana" w:hAnsi="Verdana"/>
-                <w:sz w:val="18"/>
-                <w:szCs w:val="18"/>
-              </w:rPr>
-              <w:t>-</w:t>
-            </w:r>
-          </w:p>
-        </w:tc>
-      </w:tr>
-      <w:tr>
-        <w:trPr>
-          <w:cantSplit/>
-          <w:trHeight w:val="567"/>
-        </w:trPr>
-        <w:tc>
-          <w:tcPr>
-            <w:tcW w:w="1640" w:type="dxa"/>
-          </w:tcPr>
-          <w:p>
-            <w:pPr>
-              <w:pStyle w:val="MtedetaljerLable"/>
-              <w:rPr>
-                <w:rFonts w:ascii="Verdana" w:hAnsi="Verdana"/>
-                <w:sz w:val="18"/>
-                <w:szCs w:val="18"/>
-              </w:rPr>
-            </w:pPr>
-            <w:r>
-              <w:rPr>
-                <w:rFonts w:ascii="Verdana" w:hAnsi="Verdana"/>
-                <w:sz w:val="18"/>
-                <w:szCs w:val="18"/>
-              </w:rPr>
               <w:t>Leder av møte:</w:t>
             </w:r>
           </w:p>
@@ -755,18 +754,8 @@
           <w:sz w:val="20"/>
           <w:szCs w:val="20"/>
         </w:rPr>
-        <w:t xml:space="preserve">Project </w:t>
-      </w:r>
-      <w:proofErr w:type="spellStart"/>
-      <w:r>
-        <w:rPr>
-          <w:rFonts w:ascii="Verdana" w:hAnsi="Verdana"/>
-          <w:sz w:val="20"/>
-          <w:szCs w:val="20"/>
-        </w:rPr>
-        <w:t>overview</w:t>
-      </w:r>
-      <w:proofErr w:type="spellEnd"/>
+        <w:t>Project overview</w:t>
+      </w:r>
     </w:p>
     <w:p>
       <w:pPr>
@@ -833,16 +822,14 @@
         </w:rPr>
         <w:t xml:space="preserve">Estimat på kostnader rundt </w:t>
       </w:r>
-      <w:proofErr w:type="gramStart"/>
-      <w:r>
-        <w:rPr>
-          <w:rFonts w:ascii="Verdana" w:hAnsi="Verdana"/>
-          <w:sz w:val="20"/>
-          <w:szCs w:val="20"/>
-        </w:rPr>
-        <w:t>manuell avvik</w:t>
-      </w:r>
-      <w:proofErr w:type="gramEnd"/>
+      <w:r>
+        <w:rPr>
+          <w:rFonts w:ascii="Verdana" w:hAnsi="Verdana"/>
+          <w:sz w:val="20"/>
+          <w:szCs w:val="20"/>
+        </w:rPr>
+        <w:t>manuelt avvik</w:t>
+      </w:r>
       <w:r>
         <w:rPr>
           <w:rFonts w:ascii="Verdana" w:hAnsi="Verdana"/>
@@ -1038,37 +1025,996 @@
       <w:pPr>
         <w:rPr>
           <w:rFonts w:ascii="Verdana" w:hAnsi="Verdana"/>
-          <w:sz w:val="18"/>
-          <w:szCs w:val="18"/>
-        </w:rPr>
-      </w:pPr>
-    </w:p>
-    <w:p>
-      <w:pPr>
-        <w:rPr>
-          <w:rFonts w:ascii="Verdana" w:hAnsi="Verdana"/>
-          <w:sz w:val="18"/>
-          <w:szCs w:val="18"/>
-        </w:rPr>
-      </w:pPr>
-    </w:p>
-    <w:p>
-      <w:pPr>
-        <w:rPr>
-          <w:rFonts w:ascii="Verdana" w:hAnsi="Verdana"/>
-          <w:sz w:val="18"/>
-          <w:szCs w:val="18"/>
-        </w:rPr>
-      </w:pPr>
-    </w:p>
-    <w:p>
-      <w:pPr>
-        <w:rPr>
-          <w:rFonts w:ascii="Verdana" w:hAnsi="Verdana"/>
-          <w:sz w:val="18"/>
-          <w:szCs w:val="18"/>
-        </w:rPr>
-      </w:pPr>
+          <w:b/>
+          <w:bCs/>
+          <w:sz w:val="20"/>
+          <w:szCs w:val="20"/>
+        </w:rPr>
+      </w:pPr>
+      <w:r>
+        <w:rPr>
+          <w:rFonts w:ascii="Verdana" w:hAnsi="Verdana"/>
+          <w:b/>
+          <w:bCs/>
+          <w:sz w:val="20"/>
+          <w:szCs w:val="20"/>
+        </w:rPr>
+        <w:t xml:space="preserve">Introduksjon </w:t>
+      </w:r>
+    </w:p>
+    <w:p>
+      <w:pPr>
+        <w:pStyle w:val="ListParagraph"/>
+        <w:numPr>
+          <w:ilvl w:val="0"/>
+          <w:numId w:val="14"/>
+        </w:numPr>
+        <w:rPr>
+          <w:rFonts w:ascii="Verdana" w:hAnsi="Verdana"/>
+          <w:sz w:val="20"/>
+          <w:szCs w:val="20"/>
+        </w:rPr>
+      </w:pPr>
+      <w:r>
+        <w:rPr>
+          <w:rFonts w:ascii="Verdana" w:hAnsi="Verdana"/>
+          <w:sz w:val="20"/>
+          <w:szCs w:val="20"/>
+        </w:rPr>
+        <w:t>Vi</w:t>
+      </w:r>
+      <w:r>
+        <w:rPr>
+          <w:rFonts w:ascii="Verdana" w:hAnsi="Verdana"/>
+          <w:sz w:val="20"/>
+          <w:szCs w:val="20"/>
+        </w:rPr>
+        <w:t>se</w:t>
+      </w:r>
+      <w:r>
+        <w:rPr>
+          <w:rFonts w:ascii="Verdana" w:hAnsi="Verdana"/>
+          <w:sz w:val="20"/>
+          <w:szCs w:val="20"/>
+        </w:rPr>
+        <w:t xml:space="preserve">t fram rapporter osv. </w:t>
+      </w:r>
+    </w:p>
+    <w:p>
+      <w:pPr>
+        <w:pStyle w:val="ListParagraph"/>
+        <w:numPr>
+          <w:ilvl w:val="0"/>
+          <w:numId w:val="14"/>
+        </w:numPr>
+        <w:rPr>
+          <w:rFonts w:ascii="Verdana" w:hAnsi="Verdana"/>
+          <w:sz w:val="20"/>
+          <w:szCs w:val="20"/>
+        </w:rPr>
+      </w:pPr>
+      <w:r>
+        <w:rPr>
+          <w:rFonts w:ascii="Verdana" w:hAnsi="Verdana"/>
+          <w:sz w:val="20"/>
+          <w:szCs w:val="20"/>
+        </w:rPr>
+        <w:t xml:space="preserve">Ingen kommentar </w:t>
+      </w:r>
+    </w:p>
+    <w:p>
+      <w:pPr>
+        <w:rPr>
+          <w:rFonts w:ascii="Verdana" w:hAnsi="Verdana"/>
+          <w:sz w:val="20"/>
+          <w:szCs w:val="20"/>
+        </w:rPr>
+      </w:pPr>
+    </w:p>
+    <w:p>
+      <w:pPr>
+        <w:rPr>
+          <w:rFonts w:ascii="Verdana" w:hAnsi="Verdana"/>
+          <w:sz w:val="20"/>
+          <w:szCs w:val="20"/>
+        </w:rPr>
+      </w:pPr>
+      <w:r>
+        <w:rPr>
+          <w:rFonts w:ascii="Verdana" w:hAnsi="Verdana"/>
+          <w:b/>
+          <w:bCs/>
+          <w:sz w:val="20"/>
+          <w:szCs w:val="20"/>
+        </w:rPr>
+        <w:t>Bærekraft</w:t>
+      </w:r>
+      <w:r>
+        <w:rPr>
+          <w:rFonts w:ascii="Verdana" w:hAnsi="Verdana"/>
+          <w:sz w:val="20"/>
+          <w:szCs w:val="20"/>
+        </w:rPr>
+        <w:t>:</w:t>
+      </w:r>
+    </w:p>
+    <w:p>
+      <w:pPr>
+        <w:pStyle w:val="ListParagraph"/>
+        <w:numPr>
+          <w:ilvl w:val="0"/>
+          <w:numId w:val="13"/>
+        </w:numPr>
+        <w:rPr>
+          <w:rFonts w:ascii="Verdana" w:hAnsi="Verdana"/>
+          <w:sz w:val="20"/>
+          <w:szCs w:val="20"/>
+        </w:rPr>
+      </w:pPr>
+      <w:r>
+        <w:rPr>
+          <w:rFonts w:ascii="Verdana" w:hAnsi="Verdana"/>
+          <w:sz w:val="20"/>
+          <w:szCs w:val="20"/>
+        </w:rPr>
+        <w:t>150000</w:t>
+      </w:r>
+      <w:r>
+        <w:rPr>
+          <w:rFonts w:ascii="Verdana" w:hAnsi="Verdana"/>
+          <w:sz w:val="20"/>
+          <w:szCs w:val="20"/>
+        </w:rPr>
+        <w:t>kr</w:t>
+      </w:r>
+      <w:r>
+        <w:rPr>
+          <w:rFonts w:ascii="Verdana" w:hAnsi="Verdana"/>
+          <w:sz w:val="20"/>
+          <w:szCs w:val="20"/>
+        </w:rPr>
+        <w:t xml:space="preserve"> for </w:t>
+      </w:r>
+      <w:r>
+        <w:rPr>
+          <w:rFonts w:ascii="Verdana" w:hAnsi="Verdana"/>
+          <w:sz w:val="20"/>
+          <w:szCs w:val="20"/>
+        </w:rPr>
+        <w:t xml:space="preserve">kun </w:t>
+      </w:r>
+      <w:r>
+        <w:rPr>
+          <w:rFonts w:ascii="Verdana" w:hAnsi="Verdana"/>
+          <w:sz w:val="20"/>
+          <w:szCs w:val="20"/>
+        </w:rPr>
+        <w:t xml:space="preserve">å lette flyet. Aldri nok med en tur. Avhengig av prosjektets størrelse. </w:t>
+      </w:r>
+    </w:p>
+    <w:p>
+      <w:pPr>
+        <w:pStyle w:val="ListParagraph"/>
+        <w:numPr>
+          <w:ilvl w:val="0"/>
+          <w:numId w:val="13"/>
+        </w:numPr>
+        <w:rPr>
+          <w:rFonts w:ascii="Verdana" w:hAnsi="Verdana"/>
+          <w:sz w:val="20"/>
+          <w:szCs w:val="20"/>
+        </w:rPr>
+      </w:pPr>
+      <w:r>
+        <w:rPr>
+          <w:rFonts w:ascii="Verdana" w:hAnsi="Verdana"/>
+          <w:sz w:val="20"/>
+          <w:szCs w:val="20"/>
+        </w:rPr>
+        <w:t xml:space="preserve">20-30 prosjekter i året med varierende størrelse. </w:t>
+      </w:r>
+    </w:p>
+    <w:p>
+      <w:pPr>
+        <w:pStyle w:val="ListParagraph"/>
+        <w:numPr>
+          <w:ilvl w:val="0"/>
+          <w:numId w:val="13"/>
+        </w:numPr>
+        <w:rPr>
+          <w:rFonts w:ascii="Verdana" w:hAnsi="Verdana"/>
+          <w:sz w:val="20"/>
+          <w:szCs w:val="20"/>
+        </w:rPr>
+      </w:pPr>
+      <w:r>
+        <w:rPr>
+          <w:rFonts w:ascii="Verdana" w:hAnsi="Verdana"/>
+          <w:sz w:val="20"/>
+          <w:szCs w:val="20"/>
+        </w:rPr>
+        <w:t>Prosjektene deles ofte i to, antall ganger de lander i løpet av prosjektet vil ha kostnad.</w:t>
+      </w:r>
+    </w:p>
+    <w:p>
+      <w:pPr>
+        <w:pStyle w:val="ListParagraph"/>
+        <w:numPr>
+          <w:ilvl w:val="0"/>
+          <w:numId w:val="13"/>
+        </w:numPr>
+        <w:rPr>
+          <w:rFonts w:ascii="Verdana" w:hAnsi="Verdana"/>
+          <w:sz w:val="20"/>
+          <w:szCs w:val="20"/>
+        </w:rPr>
+      </w:pPr>
+      <w:r>
+        <w:rPr>
+          <w:rFonts w:ascii="Verdana" w:hAnsi="Verdana"/>
+          <w:sz w:val="20"/>
+          <w:szCs w:val="20"/>
+        </w:rPr>
+        <w:t xml:space="preserve">Drivstoff-forbruk per flydd kilometer. Kartverket krever at 30% av vektinga på anskaffelse av tilbud er basert på bærekraft. </w:t>
+      </w:r>
+    </w:p>
+    <w:p>
+      <w:pPr>
+        <w:pStyle w:val="ListParagraph"/>
+        <w:numPr>
+          <w:ilvl w:val="0"/>
+          <w:numId w:val="13"/>
+        </w:numPr>
+        <w:rPr>
+          <w:rFonts w:ascii="Verdana" w:hAnsi="Verdana"/>
+          <w:sz w:val="20"/>
+          <w:szCs w:val="20"/>
+        </w:rPr>
+      </w:pPr>
+      <w:r>
+        <w:rPr>
+          <w:rFonts w:ascii="Verdana" w:hAnsi="Verdana"/>
+          <w:sz w:val="20"/>
+          <w:szCs w:val="20"/>
+        </w:rPr>
+        <w:t xml:space="preserve">Alle fly-baserte selskap leverer anbud basert på gamle bensindrevet fly. Stripene som skal flys vites på forhand, men "stiene" rundt kan variere veldig. Dette betyr </w:t>
+      </w:r>
+      <w:r>
+        <w:rPr>
+          <w:rFonts w:ascii="Verdana" w:hAnsi="Verdana"/>
+          <w:sz w:val="20"/>
+          <w:szCs w:val="20"/>
+        </w:rPr>
+        <w:lastRenderedPageBreak/>
+        <w:t xml:space="preserve">at det vil være mye mer flyging enn planlagt så kartverket må vurdere </w:t>
+      </w:r>
+      <w:proofErr w:type="spellStart"/>
+      <w:r>
+        <w:rPr>
+          <w:rFonts w:ascii="Verdana" w:hAnsi="Verdana"/>
+          <w:sz w:val="20"/>
+          <w:szCs w:val="20"/>
+        </w:rPr>
+        <w:t>flyplanene</w:t>
+      </w:r>
+      <w:proofErr w:type="spellEnd"/>
+      <w:r>
+        <w:rPr>
+          <w:rFonts w:ascii="Verdana" w:hAnsi="Verdana"/>
+          <w:sz w:val="20"/>
+          <w:szCs w:val="20"/>
+        </w:rPr>
+        <w:t xml:space="preserve"> grundig.</w:t>
+      </w:r>
+    </w:p>
+    <w:p>
+      <w:pPr>
+        <w:pStyle w:val="ListParagraph"/>
+        <w:numPr>
+          <w:ilvl w:val="0"/>
+          <w:numId w:val="13"/>
+        </w:numPr>
+        <w:rPr>
+          <w:rFonts w:ascii="Verdana" w:hAnsi="Verdana"/>
+          <w:sz w:val="20"/>
+          <w:szCs w:val="20"/>
+        </w:rPr>
+      </w:pPr>
+      <w:r>
+        <w:rPr>
+          <w:rFonts w:ascii="Verdana" w:hAnsi="Verdana"/>
+          <w:sz w:val="20"/>
+          <w:szCs w:val="20"/>
+        </w:rPr>
+        <w:t xml:space="preserve">De bruker ikke turbo motor så det koster kanskje mer på bærekraft. </w:t>
+      </w:r>
+    </w:p>
+    <w:p>
+      <w:pPr>
+        <w:pStyle w:val="ListParagraph"/>
+        <w:numPr>
+          <w:ilvl w:val="0"/>
+          <w:numId w:val="13"/>
+        </w:numPr>
+        <w:rPr>
+          <w:rFonts w:ascii="Verdana" w:hAnsi="Verdana"/>
+          <w:sz w:val="20"/>
+          <w:szCs w:val="20"/>
+        </w:rPr>
+      </w:pPr>
+      <w:r>
+        <w:rPr>
+          <w:rFonts w:ascii="Verdana" w:hAnsi="Verdana"/>
+          <w:sz w:val="20"/>
+          <w:szCs w:val="20"/>
+        </w:rPr>
+        <w:t>Manuell sjekking ca. 250 bilder per time. I fjor ble det sjekket 126047 bilder.</w:t>
+      </w:r>
+    </w:p>
+    <w:p>
+      <w:pPr>
+        <w:ind w:left="360"/>
+        <w:rPr>
+          <w:rFonts w:ascii="Verdana" w:hAnsi="Verdana"/>
+          <w:sz w:val="20"/>
+          <w:szCs w:val="20"/>
+        </w:rPr>
+      </w:pPr>
+    </w:p>
+    <w:p>
+      <w:pPr>
+        <w:rPr>
+          <w:rFonts w:ascii="Verdana" w:hAnsi="Verdana"/>
+          <w:b/>
+          <w:bCs/>
+          <w:sz w:val="20"/>
+          <w:szCs w:val="20"/>
+        </w:rPr>
+      </w:pPr>
+      <w:r>
+        <w:rPr>
+          <w:rFonts w:ascii="Verdana" w:hAnsi="Verdana"/>
+          <w:b/>
+          <w:bCs/>
+          <w:sz w:val="20"/>
+          <w:szCs w:val="20"/>
+        </w:rPr>
+        <w:t>Lin</w:t>
+      </w:r>
+      <w:r>
+        <w:rPr>
+          <w:rFonts w:ascii="Verdana" w:hAnsi="Verdana"/>
+          <w:b/>
+          <w:bCs/>
+          <w:sz w:val="20"/>
+          <w:szCs w:val="20"/>
+        </w:rPr>
+        <w:t>j</w:t>
+      </w:r>
+      <w:r>
+        <w:rPr>
+          <w:rFonts w:ascii="Verdana" w:hAnsi="Verdana"/>
+          <w:b/>
+          <w:bCs/>
+          <w:sz w:val="20"/>
+          <w:szCs w:val="20"/>
+        </w:rPr>
+        <w:t xml:space="preserve">e </w:t>
+      </w:r>
+      <w:r>
+        <w:rPr>
+          <w:rFonts w:ascii="Verdana" w:hAnsi="Verdana"/>
+          <w:b/>
+          <w:bCs/>
+          <w:sz w:val="20"/>
+          <w:szCs w:val="20"/>
+        </w:rPr>
+        <w:t>artefakt:</w:t>
+      </w:r>
+    </w:p>
+    <w:p>
+      <w:pPr>
+        <w:pStyle w:val="ListParagraph"/>
+        <w:numPr>
+          <w:ilvl w:val="0"/>
+          <w:numId w:val="13"/>
+        </w:numPr>
+        <w:ind w:left="360"/>
+        <w:rPr>
+          <w:rFonts w:ascii="Verdana" w:hAnsi="Verdana"/>
+          <w:sz w:val="20"/>
+          <w:szCs w:val="20"/>
+        </w:rPr>
+      </w:pPr>
+      <w:r>
+        <w:rPr>
+          <w:rFonts w:ascii="Verdana" w:hAnsi="Verdana"/>
+          <w:sz w:val="20"/>
+          <w:szCs w:val="20"/>
+        </w:rPr>
+        <w:t xml:space="preserve">De vet ikke helt hva som fører til feilene. </w:t>
+      </w:r>
+    </w:p>
+    <w:p>
+      <w:pPr>
+        <w:pStyle w:val="ListParagraph"/>
+        <w:numPr>
+          <w:ilvl w:val="0"/>
+          <w:numId w:val="13"/>
+        </w:numPr>
+        <w:ind w:left="360"/>
+        <w:rPr>
+          <w:rFonts w:ascii="Verdana" w:hAnsi="Verdana"/>
+          <w:sz w:val="20"/>
+          <w:szCs w:val="20"/>
+        </w:rPr>
+      </w:pPr>
+      <w:r>
+        <w:rPr>
+          <w:rFonts w:ascii="Verdana" w:hAnsi="Verdana"/>
+          <w:sz w:val="20"/>
+          <w:szCs w:val="20"/>
+        </w:rPr>
+        <w:t xml:space="preserve">Kan være overføringsfeil, kan være sensorfeil. Bjørge mener det er software feil ettersom feilen ikke systematisk følger gjennom hele datasettet. Mange feilkilder så det er vanskelig å finne hva som kan føre til dette. Dette er ikke et systematisk feil likt som svart-hvit bildene som er scannet som hadde flekker pga. smuss på plate under </w:t>
+      </w:r>
+      <w:proofErr w:type="spellStart"/>
+      <w:r>
+        <w:rPr>
+          <w:rFonts w:ascii="Verdana" w:hAnsi="Verdana"/>
+          <w:sz w:val="20"/>
+          <w:szCs w:val="20"/>
+        </w:rPr>
+        <w:t>scanning</w:t>
+      </w:r>
+      <w:proofErr w:type="spellEnd"/>
+      <w:r>
+        <w:rPr>
+          <w:rFonts w:ascii="Verdana" w:hAnsi="Verdana"/>
+          <w:sz w:val="20"/>
+          <w:szCs w:val="20"/>
+        </w:rPr>
+        <w:t xml:space="preserve">. </w:t>
+      </w:r>
+    </w:p>
+    <w:p>
+      <w:pPr>
+        <w:pStyle w:val="ListParagraph"/>
+        <w:numPr>
+          <w:ilvl w:val="0"/>
+          <w:numId w:val="13"/>
+        </w:numPr>
+        <w:ind w:left="360"/>
+        <w:rPr>
+          <w:rFonts w:ascii="Verdana" w:hAnsi="Verdana"/>
+          <w:sz w:val="20"/>
+          <w:szCs w:val="20"/>
+        </w:rPr>
+      </w:pPr>
+      <w:r>
+        <w:rPr>
+          <w:rFonts w:ascii="Verdana" w:hAnsi="Verdana"/>
+          <w:sz w:val="20"/>
+          <w:szCs w:val="20"/>
+        </w:rPr>
+        <w:t>Turid</w:t>
+      </w:r>
+      <w:r>
+        <w:rPr>
+          <w:rFonts w:ascii="Verdana" w:hAnsi="Verdana"/>
+          <w:sz w:val="20"/>
+          <w:szCs w:val="20"/>
+        </w:rPr>
+        <w:t xml:space="preserve"> kommer til å </w:t>
+      </w:r>
+      <w:r>
+        <w:rPr>
+          <w:rFonts w:ascii="Verdana" w:hAnsi="Verdana"/>
+          <w:sz w:val="20"/>
+          <w:szCs w:val="20"/>
+        </w:rPr>
+        <w:t>spør</w:t>
+      </w:r>
+      <w:r>
+        <w:rPr>
+          <w:rFonts w:ascii="Verdana" w:hAnsi="Verdana"/>
+          <w:sz w:val="20"/>
+          <w:szCs w:val="20"/>
+        </w:rPr>
+        <w:t>re</w:t>
+      </w:r>
+      <w:r>
+        <w:rPr>
+          <w:rFonts w:ascii="Verdana" w:hAnsi="Verdana"/>
+          <w:sz w:val="20"/>
+          <w:szCs w:val="20"/>
+        </w:rPr>
+        <w:t xml:space="preserve"> Andreas</w:t>
+      </w:r>
+      <w:r>
+        <w:rPr>
+          <w:rFonts w:ascii="Verdana" w:hAnsi="Verdana"/>
+          <w:sz w:val="20"/>
+          <w:szCs w:val="20"/>
+        </w:rPr>
+        <w:t xml:space="preserve"> Korsnes og komme tilbake med svar</w:t>
+      </w:r>
+      <w:r>
+        <w:rPr>
+          <w:rFonts w:ascii="Verdana" w:hAnsi="Verdana"/>
+          <w:sz w:val="20"/>
+          <w:szCs w:val="20"/>
+        </w:rPr>
+        <w:t xml:space="preserve"> på epost</w:t>
+      </w:r>
+    </w:p>
+    <w:p>
+      <w:pPr>
+        <w:rPr>
+          <w:rFonts w:ascii="Verdana" w:hAnsi="Verdana"/>
+          <w:sz w:val="20"/>
+          <w:szCs w:val="20"/>
+        </w:rPr>
+      </w:pPr>
+    </w:p>
+    <w:p>
+      <w:pPr>
+        <w:rPr>
+          <w:rFonts w:ascii="Verdana" w:hAnsi="Verdana"/>
+          <w:b/>
+          <w:bCs/>
+          <w:sz w:val="20"/>
+          <w:szCs w:val="20"/>
+        </w:rPr>
+      </w:pPr>
+      <w:r>
+        <w:rPr>
+          <w:rFonts w:ascii="Verdana" w:hAnsi="Verdana"/>
+          <w:b/>
+          <w:bCs/>
+          <w:sz w:val="20"/>
+          <w:szCs w:val="20"/>
+        </w:rPr>
+        <w:t>Dato for presentasjon</w:t>
+      </w:r>
+      <w:r>
+        <w:rPr>
+          <w:rFonts w:ascii="Verdana" w:hAnsi="Verdana"/>
+          <w:b/>
+          <w:bCs/>
+          <w:sz w:val="20"/>
+          <w:szCs w:val="20"/>
+        </w:rPr>
+        <w:t>:</w:t>
+      </w:r>
+    </w:p>
+    <w:p>
+      <w:pPr>
+        <w:pStyle w:val="ListParagraph"/>
+        <w:numPr>
+          <w:ilvl w:val="0"/>
+          <w:numId w:val="13"/>
+        </w:numPr>
+        <w:ind w:left="360"/>
+        <w:rPr>
+          <w:rFonts w:ascii="Verdana" w:hAnsi="Verdana"/>
+          <w:sz w:val="20"/>
+          <w:szCs w:val="20"/>
+        </w:rPr>
+      </w:pPr>
+      <w:r>
+        <w:rPr>
+          <w:rFonts w:ascii="Verdana" w:hAnsi="Verdana"/>
+          <w:sz w:val="20"/>
+          <w:szCs w:val="20"/>
+        </w:rPr>
+        <w:t xml:space="preserve">Blir </w:t>
+      </w:r>
+      <w:r>
+        <w:rPr>
+          <w:rFonts w:ascii="Verdana" w:hAnsi="Verdana"/>
+          <w:sz w:val="20"/>
+          <w:szCs w:val="20"/>
+        </w:rPr>
+        <w:t xml:space="preserve">for kartverket den </w:t>
+      </w:r>
+      <w:r>
+        <w:rPr>
+          <w:rFonts w:ascii="Verdana" w:hAnsi="Verdana"/>
+          <w:sz w:val="20"/>
+          <w:szCs w:val="20"/>
+        </w:rPr>
+        <w:t>29.m</w:t>
+      </w:r>
+      <w:r>
+        <w:rPr>
+          <w:rFonts w:ascii="Verdana" w:hAnsi="Verdana"/>
+          <w:sz w:val="20"/>
+          <w:szCs w:val="20"/>
+        </w:rPr>
+        <w:t>ai</w:t>
+      </w:r>
+      <w:r>
+        <w:rPr>
+          <w:rFonts w:ascii="Verdana" w:hAnsi="Verdana"/>
+          <w:sz w:val="20"/>
+          <w:szCs w:val="20"/>
+        </w:rPr>
+        <w:t xml:space="preserve"> i</w:t>
+      </w:r>
+      <w:r>
+        <w:rPr>
+          <w:rFonts w:ascii="Verdana" w:hAnsi="Verdana"/>
+          <w:sz w:val="20"/>
+          <w:szCs w:val="20"/>
+        </w:rPr>
+        <w:t xml:space="preserve"> Molde klokken 10. </w:t>
+      </w:r>
+    </w:p>
+    <w:p>
+      <w:pPr>
+        <w:pStyle w:val="ListParagraph"/>
+        <w:numPr>
+          <w:ilvl w:val="0"/>
+          <w:numId w:val="13"/>
+        </w:numPr>
+        <w:ind w:left="360"/>
+        <w:rPr>
+          <w:rFonts w:ascii="Verdana" w:hAnsi="Verdana"/>
+          <w:sz w:val="20"/>
+          <w:szCs w:val="20"/>
+        </w:rPr>
+      </w:pPr>
+      <w:r>
+        <w:rPr>
+          <w:rFonts w:ascii="Verdana" w:hAnsi="Verdana"/>
+          <w:sz w:val="20"/>
+          <w:szCs w:val="20"/>
+        </w:rPr>
+        <w:t xml:space="preserve">De sender en møteinvitasjon. </w:t>
+      </w:r>
+    </w:p>
+    <w:p>
+      <w:pPr>
+        <w:rPr>
+          <w:rFonts w:ascii="Verdana" w:hAnsi="Verdana"/>
+          <w:sz w:val="20"/>
+          <w:szCs w:val="20"/>
+        </w:rPr>
+      </w:pPr>
+    </w:p>
+    <w:p>
+      <w:pPr>
+        <w:rPr>
+          <w:rFonts w:ascii="Verdana" w:hAnsi="Verdana"/>
+          <w:b/>
+          <w:bCs/>
+          <w:sz w:val="20"/>
+          <w:szCs w:val="20"/>
+        </w:rPr>
+      </w:pPr>
+      <w:r>
+        <w:rPr>
+          <w:rFonts w:ascii="Verdana" w:hAnsi="Verdana"/>
+          <w:b/>
+          <w:bCs/>
+          <w:sz w:val="20"/>
+          <w:szCs w:val="20"/>
+        </w:rPr>
+        <w:t>Bachelorpresentasjon</w:t>
+      </w:r>
+      <w:r>
+        <w:rPr>
+          <w:rFonts w:ascii="Verdana" w:hAnsi="Verdana"/>
+          <w:b/>
+          <w:bCs/>
+          <w:sz w:val="20"/>
+          <w:szCs w:val="20"/>
+        </w:rPr>
+        <w:t>:</w:t>
+      </w:r>
+    </w:p>
+    <w:p>
+      <w:pPr>
+        <w:pStyle w:val="ListParagraph"/>
+        <w:numPr>
+          <w:ilvl w:val="0"/>
+          <w:numId w:val="13"/>
+        </w:numPr>
+        <w:ind w:left="360"/>
+        <w:rPr>
+          <w:rFonts w:ascii="Verdana" w:hAnsi="Verdana"/>
+          <w:sz w:val="20"/>
+          <w:szCs w:val="20"/>
+        </w:rPr>
+      </w:pPr>
+      <w:r>
+        <w:rPr>
+          <w:rFonts w:ascii="Verdana" w:hAnsi="Verdana"/>
+          <w:sz w:val="20"/>
+          <w:szCs w:val="20"/>
+        </w:rPr>
+        <w:t xml:space="preserve">De skal undersøke og komme tilbake med dette. </w:t>
+      </w:r>
+    </w:p>
+    <w:p>
+      <w:pPr>
+        <w:rPr>
+          <w:rFonts w:ascii="Verdana" w:hAnsi="Verdana"/>
+          <w:sz w:val="20"/>
+          <w:szCs w:val="20"/>
+        </w:rPr>
+      </w:pPr>
+    </w:p>
+    <w:p>
+      <w:pPr>
+        <w:rPr>
+          <w:rFonts w:ascii="Verdana" w:hAnsi="Verdana"/>
+          <w:b/>
+          <w:bCs/>
+          <w:sz w:val="20"/>
+          <w:szCs w:val="20"/>
+        </w:rPr>
+      </w:pPr>
+      <w:r>
+        <w:rPr>
+          <w:rFonts w:ascii="Verdana" w:hAnsi="Verdana"/>
+          <w:b/>
+          <w:bCs/>
+          <w:sz w:val="20"/>
+          <w:szCs w:val="20"/>
+        </w:rPr>
+        <w:t>Planer de neste ukene</w:t>
+      </w:r>
+      <w:r>
+        <w:rPr>
+          <w:rFonts w:ascii="Verdana" w:hAnsi="Verdana"/>
+          <w:b/>
+          <w:bCs/>
+          <w:sz w:val="20"/>
+          <w:szCs w:val="20"/>
+        </w:rPr>
+        <w:t>:</w:t>
+      </w:r>
+    </w:p>
+    <w:p>
+      <w:pPr>
+        <w:pStyle w:val="ListParagraph"/>
+        <w:numPr>
+          <w:ilvl w:val="0"/>
+          <w:numId w:val="13"/>
+        </w:numPr>
+        <w:rPr>
+          <w:rFonts w:ascii="Verdana" w:hAnsi="Verdana"/>
+          <w:sz w:val="20"/>
+          <w:szCs w:val="20"/>
+        </w:rPr>
+      </w:pPr>
+      <w:r>
+        <w:rPr>
+          <w:rFonts w:ascii="Verdana" w:hAnsi="Verdana"/>
+          <w:sz w:val="20"/>
+          <w:szCs w:val="20"/>
+        </w:rPr>
+        <w:t>Jobbe med d</w:t>
+      </w:r>
+      <w:r>
+        <w:rPr>
+          <w:rFonts w:ascii="Verdana" w:hAnsi="Verdana"/>
+          <w:sz w:val="20"/>
+          <w:szCs w:val="20"/>
+        </w:rPr>
+        <w:t xml:space="preserve">okumentasjon og </w:t>
+      </w:r>
+      <w:r>
+        <w:rPr>
+          <w:rFonts w:ascii="Verdana" w:hAnsi="Verdana"/>
+          <w:sz w:val="20"/>
+          <w:szCs w:val="20"/>
+        </w:rPr>
+        <w:t>r</w:t>
+      </w:r>
+      <w:r>
+        <w:rPr>
+          <w:rFonts w:ascii="Verdana" w:hAnsi="Verdana"/>
+          <w:sz w:val="20"/>
+          <w:szCs w:val="20"/>
+        </w:rPr>
+        <w:t xml:space="preserve">apport </w:t>
+      </w:r>
+      <w:r>
+        <w:rPr>
+          <w:rFonts w:ascii="Verdana" w:hAnsi="Verdana"/>
+          <w:sz w:val="20"/>
+          <w:szCs w:val="20"/>
+        </w:rPr>
+        <w:t>hovedsakelig</w:t>
+      </w:r>
+      <w:r>
+        <w:rPr>
+          <w:rFonts w:ascii="Verdana" w:hAnsi="Verdana"/>
+          <w:sz w:val="20"/>
+          <w:szCs w:val="20"/>
+        </w:rPr>
+        <w:t xml:space="preserve">. </w:t>
+      </w:r>
+    </w:p>
+    <w:p>
+      <w:pPr>
+        <w:pStyle w:val="ListParagraph"/>
+        <w:numPr>
+          <w:ilvl w:val="0"/>
+          <w:numId w:val="13"/>
+        </w:numPr>
+        <w:rPr>
+          <w:rFonts w:ascii="Verdana" w:hAnsi="Verdana"/>
+          <w:sz w:val="20"/>
+          <w:szCs w:val="20"/>
+        </w:rPr>
+      </w:pPr>
+      <w:r>
+        <w:rPr>
+          <w:rFonts w:ascii="Verdana" w:hAnsi="Verdana"/>
+          <w:sz w:val="20"/>
+          <w:szCs w:val="20"/>
+        </w:rPr>
+        <w:t>Blir ikke noe møte før oppgaven er i boks og vi blir å presentere det.</w:t>
+      </w:r>
+    </w:p>
+    <w:p>
+      <w:pPr>
+        <w:rPr>
+          <w:rFonts w:ascii="Verdana" w:hAnsi="Verdana"/>
+          <w:sz w:val="20"/>
+          <w:szCs w:val="20"/>
+        </w:rPr>
+      </w:pPr>
+    </w:p>
+    <w:p>
+      <w:pPr>
+        <w:rPr>
+          <w:rFonts w:ascii="Verdana" w:hAnsi="Verdana"/>
+          <w:b/>
+          <w:bCs/>
+          <w:sz w:val="20"/>
+          <w:szCs w:val="20"/>
+        </w:rPr>
+      </w:pPr>
+      <w:r>
+        <w:rPr>
+          <w:rFonts w:ascii="Verdana" w:hAnsi="Verdana"/>
+          <w:b/>
+          <w:bCs/>
+          <w:sz w:val="20"/>
+          <w:szCs w:val="20"/>
+        </w:rPr>
+        <w:t>Avslutning</w:t>
+      </w:r>
+      <w:r>
+        <w:rPr>
+          <w:rFonts w:ascii="Verdana" w:hAnsi="Verdana"/>
+          <w:b/>
+          <w:bCs/>
+          <w:sz w:val="20"/>
+          <w:szCs w:val="20"/>
+        </w:rPr>
+        <w:t xml:space="preserve"> og andre spørsmål</w:t>
+      </w:r>
+      <w:r>
+        <w:rPr>
+          <w:rFonts w:ascii="Verdana" w:hAnsi="Verdana"/>
+          <w:b/>
+          <w:bCs/>
+          <w:sz w:val="20"/>
+          <w:szCs w:val="20"/>
+        </w:rPr>
+        <w:t>:</w:t>
+      </w:r>
+      <w:r>
+        <w:rPr>
+          <w:rFonts w:ascii="Verdana" w:hAnsi="Verdana"/>
+          <w:b/>
+          <w:bCs/>
+          <w:sz w:val="20"/>
+          <w:szCs w:val="20"/>
+        </w:rPr>
+        <w:t xml:space="preserve"> </w:t>
+      </w:r>
+    </w:p>
+    <w:p>
+      <w:pPr>
+        <w:pStyle w:val="ListParagraph"/>
+        <w:numPr>
+          <w:ilvl w:val="0"/>
+          <w:numId w:val="13"/>
+        </w:numPr>
+        <w:rPr>
+          <w:rFonts w:ascii="Verdana" w:hAnsi="Verdana"/>
+          <w:sz w:val="20"/>
+          <w:szCs w:val="20"/>
+        </w:rPr>
+      </w:pPr>
+      <w:r>
+        <w:rPr>
+          <w:rFonts w:ascii="Verdana" w:hAnsi="Verdana"/>
+          <w:sz w:val="20"/>
+          <w:szCs w:val="20"/>
+        </w:rPr>
+        <w:t xml:space="preserve">De syntes vi har løst oppgaven godt, spesielt med såpass vag problemstilling. </w:t>
+      </w:r>
+    </w:p>
+    <w:p>
+      <w:pPr>
+        <w:pStyle w:val="ListParagraph"/>
+        <w:numPr>
+          <w:ilvl w:val="0"/>
+          <w:numId w:val="13"/>
+        </w:numPr>
+        <w:rPr>
+          <w:rFonts w:ascii="Verdana" w:hAnsi="Verdana"/>
+          <w:sz w:val="20"/>
+          <w:szCs w:val="20"/>
+        </w:rPr>
+      </w:pPr>
+      <w:r>
+        <w:rPr>
+          <w:rFonts w:ascii="Verdana" w:hAnsi="Verdana"/>
+          <w:sz w:val="20"/>
+          <w:szCs w:val="20"/>
+        </w:rPr>
+        <w:t xml:space="preserve">Kan muligens ta oppgaven videre som en master-oppgave. </w:t>
+      </w:r>
+    </w:p>
+    <w:p>
+      <w:pPr>
+        <w:pStyle w:val="ListParagraph"/>
+        <w:numPr>
+          <w:ilvl w:val="0"/>
+          <w:numId w:val="13"/>
+        </w:numPr>
+        <w:rPr>
+          <w:rFonts w:ascii="Verdana" w:hAnsi="Verdana"/>
+          <w:sz w:val="20"/>
+          <w:szCs w:val="20"/>
+        </w:rPr>
+      </w:pPr>
+      <w:r>
+        <w:rPr>
+          <w:rFonts w:ascii="Verdana" w:hAnsi="Verdana"/>
+          <w:sz w:val="20"/>
+          <w:szCs w:val="20"/>
+        </w:rPr>
+        <w:t xml:space="preserve">Turid sjekker angående linje avvik på bilder. Kartverket diskuterer. </w:t>
+      </w:r>
+    </w:p>
+    <w:p>
+      <w:pPr>
+        <w:pStyle w:val="ListParagraph"/>
+        <w:numPr>
+          <w:ilvl w:val="0"/>
+          <w:numId w:val="13"/>
+        </w:numPr>
+        <w:rPr>
+          <w:rFonts w:ascii="Verdana" w:hAnsi="Verdana"/>
+          <w:sz w:val="20"/>
+          <w:szCs w:val="20"/>
+        </w:rPr>
+      </w:pPr>
+      <w:r>
+        <w:rPr>
+          <w:rFonts w:ascii="Verdana" w:hAnsi="Verdana"/>
+          <w:sz w:val="20"/>
+          <w:szCs w:val="20"/>
+        </w:rPr>
+        <w:t>Vi tar med optimalisering osv. på rapporten ettersom det kan veie opp ganske mye på karakter osv.</w:t>
+      </w:r>
+      <w:r>
+        <w:rPr>
+          <w:rFonts w:ascii="Verdana" w:hAnsi="Verdana"/>
+          <w:sz w:val="20"/>
+          <w:szCs w:val="20"/>
+        </w:rPr>
+        <w:t> </w:t>
+      </w:r>
     </w:p>
     <w:sectPr>
       <w:headerReference w:type="default" r:id="rId8"/>
@@ -1441,6 +2387,118 @@
     </w:lvl>
   </w:abstractNum>
   <w:abstractNum w:abstractNumId="3" w15:restartNumberingAfterBreak="0">
+    <w:nsid w:val="0ECF610A"/>
+    <w:multiLevelType w:val="hybridMultilevel"/>
+    <w:tmpl w:val="337EE56E"/>
+    <w:lvl w:ilvl="0" w:tplc="D00A94C0">
+      <w:numFmt w:val="bullet"/>
+      <w:lvlText w:val="-"/>
+      <w:lvlJc w:val="left"/>
+      <w:pPr>
+        <w:ind w:left="720" w:hanging="360"/>
+      </w:pPr>
+      <w:rPr>
+        <w:rFonts w:ascii="Verdana" w:eastAsiaTheme="minorHAnsi" w:hAnsi="Verdana" w:cstheme="minorBidi" w:hint="default"/>
+      </w:rPr>
+    </w:lvl>
+    <w:lvl w:ilvl="1" w:tplc="04140003" w:tentative="1">
+      <w:start w:val="1"/>
+      <w:numFmt w:val="bullet"/>
+      <w:lvlText w:val="o"/>
+      <w:lvlJc w:val="left"/>
+      <w:pPr>
+        <w:ind w:left="1440" w:hanging="360"/>
+      </w:pPr>
+      <w:rPr>
+        <w:rFonts w:ascii="Courier New" w:hAnsi="Courier New" w:cs="Courier New" w:hint="default"/>
+      </w:rPr>
+    </w:lvl>
+    <w:lvl w:ilvl="2" w:tplc="04140005" w:tentative="1">
+      <w:start w:val="1"/>
+      <w:numFmt w:val="bullet"/>
+      <w:lvlText w:val=""/>
+      <w:lvlJc w:val="left"/>
+      <w:pPr>
+        <w:ind w:left="2160" w:hanging="360"/>
+      </w:pPr>
+      <w:rPr>
+        <w:rFonts w:ascii="Wingdings" w:hAnsi="Wingdings" w:hint="default"/>
+      </w:rPr>
+    </w:lvl>
+    <w:lvl w:ilvl="3" w:tplc="04140001" w:tentative="1">
+      <w:start w:val="1"/>
+      <w:numFmt w:val="bullet"/>
+      <w:lvlText w:val=""/>
+      <w:lvlJc w:val="left"/>
+      <w:pPr>
+        <w:ind w:left="2880" w:hanging="360"/>
+      </w:pPr>
+      <w:rPr>
+        <w:rFonts w:ascii="Symbol" w:hAnsi="Symbol" w:hint="default"/>
+      </w:rPr>
+    </w:lvl>
+    <w:lvl w:ilvl="4" w:tplc="04140003" w:tentative="1">
+      <w:start w:val="1"/>
+      <w:numFmt w:val="bullet"/>
+      <w:lvlText w:val="o"/>
+      <w:lvlJc w:val="left"/>
+      <w:pPr>
+        <w:ind w:left="3600" w:hanging="360"/>
+      </w:pPr>
+      <w:rPr>
+        <w:rFonts w:ascii="Courier New" w:hAnsi="Courier New" w:cs="Courier New" w:hint="default"/>
+      </w:rPr>
+    </w:lvl>
+    <w:lvl w:ilvl="5" w:tplc="04140005" w:tentative="1">
+      <w:start w:val="1"/>
+      <w:numFmt w:val="bullet"/>
+      <w:lvlText w:val=""/>
+      <w:lvlJc w:val="left"/>
+      <w:pPr>
+        <w:ind w:left="4320" w:hanging="360"/>
+      </w:pPr>
+      <w:rPr>
+        <w:rFonts w:ascii="Wingdings" w:hAnsi="Wingdings" w:hint="default"/>
+      </w:rPr>
+    </w:lvl>
+    <w:lvl w:ilvl="6" w:tplc="04140001" w:tentative="1">
+      <w:start w:val="1"/>
+      <w:numFmt w:val="bullet"/>
+      <w:lvlText w:val=""/>
+      <w:lvlJc w:val="left"/>
+      <w:pPr>
+        <w:ind w:left="5040" w:hanging="360"/>
+      </w:pPr>
+      <w:rPr>
+        <w:rFonts w:ascii="Symbol" w:hAnsi="Symbol" w:hint="default"/>
+      </w:rPr>
+    </w:lvl>
+    <w:lvl w:ilvl="7" w:tplc="04140003" w:tentative="1">
+      <w:start w:val="1"/>
+      <w:numFmt w:val="bullet"/>
+      <w:lvlText w:val="o"/>
+      <w:lvlJc w:val="left"/>
+      <w:pPr>
+        <w:ind w:left="5760" w:hanging="360"/>
+      </w:pPr>
+      <w:rPr>
+        <w:rFonts w:ascii="Courier New" w:hAnsi="Courier New" w:cs="Courier New" w:hint="default"/>
+      </w:rPr>
+    </w:lvl>
+    <w:lvl w:ilvl="8" w:tplc="04140005" w:tentative="1">
+      <w:start w:val="1"/>
+      <w:numFmt w:val="bullet"/>
+      <w:lvlText w:val=""/>
+      <w:lvlJc w:val="left"/>
+      <w:pPr>
+        <w:ind w:left="6480" w:hanging="360"/>
+      </w:pPr>
+      <w:rPr>
+        <w:rFonts w:ascii="Wingdings" w:hAnsi="Wingdings" w:hint="default"/>
+      </w:rPr>
+    </w:lvl>
+  </w:abstractNum>
+  <w:abstractNum w:abstractNumId="4" w15:restartNumberingAfterBreak="0">
     <w:nsid w:val="0EEC3053"/>
     <w:multiLevelType w:val="hybridMultilevel"/>
     <w:tmpl w:val="2370D6D6"/>
@@ -1552,7 +2610,7 @@
       </w:rPr>
     </w:lvl>
   </w:abstractNum>
-  <w:abstractNum w:abstractNumId="4" w15:restartNumberingAfterBreak="0">
+  <w:abstractNum w:abstractNumId="5" w15:restartNumberingAfterBreak="0">
     <w:nsid w:val="311B07A9"/>
     <w:multiLevelType w:val="hybridMultilevel"/>
     <w:tmpl w:val="1E703654"/>
@@ -1638,7 +2696,7 @@
       </w:pPr>
     </w:lvl>
   </w:abstractNum>
-  <w:abstractNum w:abstractNumId="5" w15:restartNumberingAfterBreak="0">
+  <w:abstractNum w:abstractNumId="6" w15:restartNumberingAfterBreak="0">
     <w:nsid w:val="3FEB490A"/>
     <w:multiLevelType w:val="hybridMultilevel"/>
     <w:tmpl w:val="FA2E4E18"/>
@@ -1750,7 +2808,7 @@
       </w:rPr>
     </w:lvl>
   </w:abstractNum>
-  <w:abstractNum w:abstractNumId="6" w15:restartNumberingAfterBreak="0">
+  <w:abstractNum w:abstractNumId="7" w15:restartNumberingAfterBreak="0">
     <w:nsid w:val="47D16F8F"/>
     <w:multiLevelType w:val="hybridMultilevel"/>
     <w:tmpl w:val="09647EAE"/>
@@ -1867,7 +2925,7 @@
       </w:rPr>
     </w:lvl>
   </w:abstractNum>
-  <w:abstractNum w:abstractNumId="7" w15:restartNumberingAfterBreak="0">
+  <w:abstractNum w:abstractNumId="8" w15:restartNumberingAfterBreak="0">
     <w:nsid w:val="4E5E3632"/>
     <w:multiLevelType w:val="hybridMultilevel"/>
     <w:tmpl w:val="B9CEB0EE"/>
@@ -1951,6 +3009,118 @@
       <w:pPr>
         <w:ind w:left="6480" w:hanging="180"/>
       </w:pPr>
+    </w:lvl>
+  </w:abstractNum>
+  <w:abstractNum w:abstractNumId="9" w15:restartNumberingAfterBreak="0">
+    <w:nsid w:val="77735093"/>
+    <w:multiLevelType w:val="hybridMultilevel"/>
+    <w:tmpl w:val="16E21A28"/>
+    <w:lvl w:ilvl="0" w:tplc="24C632D8">
+      <w:numFmt w:val="bullet"/>
+      <w:lvlText w:val="-"/>
+      <w:lvlJc w:val="left"/>
+      <w:pPr>
+        <w:ind w:left="720" w:hanging="360"/>
+      </w:pPr>
+      <w:rPr>
+        <w:rFonts w:ascii="Verdana" w:eastAsiaTheme="minorHAnsi" w:hAnsi="Verdana" w:cstheme="minorBidi" w:hint="default"/>
+      </w:rPr>
+    </w:lvl>
+    <w:lvl w:ilvl="1" w:tplc="04140003" w:tentative="1">
+      <w:start w:val="1"/>
+      <w:numFmt w:val="bullet"/>
+      <w:lvlText w:val="o"/>
+      <w:lvlJc w:val="left"/>
+      <w:pPr>
+        <w:ind w:left="1440" w:hanging="360"/>
+      </w:pPr>
+      <w:rPr>
+        <w:rFonts w:ascii="Courier New" w:hAnsi="Courier New" w:cs="Courier New" w:hint="default"/>
+      </w:rPr>
+    </w:lvl>
+    <w:lvl w:ilvl="2" w:tplc="04140005" w:tentative="1">
+      <w:start w:val="1"/>
+      <w:numFmt w:val="bullet"/>
+      <w:lvlText w:val=""/>
+      <w:lvlJc w:val="left"/>
+      <w:pPr>
+        <w:ind w:left="2160" w:hanging="360"/>
+      </w:pPr>
+      <w:rPr>
+        <w:rFonts w:ascii="Wingdings" w:hAnsi="Wingdings" w:hint="default"/>
+      </w:rPr>
+    </w:lvl>
+    <w:lvl w:ilvl="3" w:tplc="04140001" w:tentative="1">
+      <w:start w:val="1"/>
+      <w:numFmt w:val="bullet"/>
+      <w:lvlText w:val=""/>
+      <w:lvlJc w:val="left"/>
+      <w:pPr>
+        <w:ind w:left="2880" w:hanging="360"/>
+      </w:pPr>
+      <w:rPr>
+        <w:rFonts w:ascii="Symbol" w:hAnsi="Symbol" w:hint="default"/>
+      </w:rPr>
+    </w:lvl>
+    <w:lvl w:ilvl="4" w:tplc="04140003" w:tentative="1">
+      <w:start w:val="1"/>
+      <w:numFmt w:val="bullet"/>
+      <w:lvlText w:val="o"/>
+      <w:lvlJc w:val="left"/>
+      <w:pPr>
+        <w:ind w:left="3600" w:hanging="360"/>
+      </w:pPr>
+      <w:rPr>
+        <w:rFonts w:ascii="Courier New" w:hAnsi="Courier New" w:cs="Courier New" w:hint="default"/>
+      </w:rPr>
+    </w:lvl>
+    <w:lvl w:ilvl="5" w:tplc="04140005" w:tentative="1">
+      <w:start w:val="1"/>
+      <w:numFmt w:val="bullet"/>
+      <w:lvlText w:val=""/>
+      <w:lvlJc w:val="left"/>
+      <w:pPr>
+        <w:ind w:left="4320" w:hanging="360"/>
+      </w:pPr>
+      <w:rPr>
+        <w:rFonts w:ascii="Wingdings" w:hAnsi="Wingdings" w:hint="default"/>
+      </w:rPr>
+    </w:lvl>
+    <w:lvl w:ilvl="6" w:tplc="04140001" w:tentative="1">
+      <w:start w:val="1"/>
+      <w:numFmt w:val="bullet"/>
+      <w:lvlText w:val=""/>
+      <w:lvlJc w:val="left"/>
+      <w:pPr>
+        <w:ind w:left="5040" w:hanging="360"/>
+      </w:pPr>
+      <w:rPr>
+        <w:rFonts w:ascii="Symbol" w:hAnsi="Symbol" w:hint="default"/>
+      </w:rPr>
+    </w:lvl>
+    <w:lvl w:ilvl="7" w:tplc="04140003" w:tentative="1">
+      <w:start w:val="1"/>
+      <w:numFmt w:val="bullet"/>
+      <w:lvlText w:val="o"/>
+      <w:lvlJc w:val="left"/>
+      <w:pPr>
+        <w:ind w:left="5760" w:hanging="360"/>
+      </w:pPr>
+      <w:rPr>
+        <w:rFonts w:ascii="Courier New" w:hAnsi="Courier New" w:cs="Courier New" w:hint="default"/>
+      </w:rPr>
+    </w:lvl>
+    <w:lvl w:ilvl="8" w:tplc="04140005" w:tentative="1">
+      <w:start w:val="1"/>
+      <w:numFmt w:val="bullet"/>
+      <w:lvlText w:val=""/>
+      <w:lvlJc w:val="left"/>
+      <w:pPr>
+        <w:ind w:left="6480" w:hanging="360"/>
+      </w:pPr>
+      <w:rPr>
+        <w:rFonts w:ascii="Wingdings" w:hAnsi="Wingdings" w:hint="default"/>
+      </w:rPr>
     </w:lvl>
   </w:abstractNum>
   <w:num w:numId="1" w16cid:durableId="349989067">
@@ -1960,16 +3130,16 @@
     <w:abstractNumId w:val="1"/>
   </w:num>
   <w:num w:numId="3" w16cid:durableId="1098016276">
-    <w:abstractNumId w:val="6"/>
+    <w:abstractNumId w:val="7"/>
   </w:num>
   <w:num w:numId="4" w16cid:durableId="146361582">
     <w:abstractNumId w:val="2"/>
   </w:num>
   <w:num w:numId="5" w16cid:durableId="187372426">
-    <w:abstractNumId w:val="7"/>
+    <w:abstractNumId w:val="8"/>
   </w:num>
   <w:num w:numId="6" w16cid:durableId="1470592258">
-    <w:abstractNumId w:val="4"/>
+    <w:abstractNumId w:val="5"/>
   </w:num>
   <w:num w:numId="7" w16cid:durableId="46027416">
     <w:abstractNumId w:val="0"/>
@@ -1981,13 +3151,19 @@
     <w:abstractNumId w:val="0"/>
   </w:num>
   <w:num w:numId="10" w16cid:durableId="741491740">
-    <w:abstractNumId w:val="3"/>
+    <w:abstractNumId w:val="4"/>
   </w:num>
   <w:num w:numId="11" w16cid:durableId="2061055329">
-    <w:abstractNumId w:val="5"/>
+    <w:abstractNumId w:val="6"/>
   </w:num>
   <w:num w:numId="12" w16cid:durableId="911964612">
     <w:abstractNumId w:val="0"/>
+  </w:num>
+  <w:num w:numId="13" w16cid:durableId="1838300499">
+    <w:abstractNumId w:val="3"/>
+  </w:num>
+  <w:num w:numId="14" w16cid:durableId="1990595875">
+    <w:abstractNumId w:val="9"/>
   </w:num>
 </w:numbering>
 </file>
@@ -2588,7 +3764,6 @@
   <w:style w:type="character" w:default="1" w:styleId="DefaultParagraphFont">
     <w:name w:val="Default Paragraph Font"/>
     <w:uiPriority w:val="1"/>
-    <w:semiHidden/>
     <w:unhideWhenUsed/>
   </w:style>
   <w:style w:type="table" w:default="1" w:styleId="TableNormal">

</xml_diff>